<commit_message>
modifiche diagrammi iterazione 1
</commit_message>
<xml_diff>
--- a/2.Iterazione1/Iterazione1.docx
+++ b/2.Iterazione1/Iterazione1.docx
@@ -5,10 +5,13 @@
   <w:body>
     <w:p>
       <w:pPr>
+        <w:pStyle w:val="Titolo1"/>
         <w:jc w:val="center"/>
         <w:rPr>
-          <w:rFonts w:ascii="Montserrat" w:eastAsiaTheme="majorEastAsia" w:hAnsi="Montserrat" w:cstheme="majorBidi"/>
+          <w:rFonts w:ascii="Montserrat" w:hAnsi="Montserrat"/>
           <w:color w:val="FF4129"/>
+          <w:sz w:val="64"/>
+          <w:szCs w:val="64"/>
         </w:rPr>
       </w:pPr>
       <w:bookmarkStart w:id="0" w:name="_Toc222162192"/>
@@ -8475,6 +8478,1834 @@
           <w:szCs w:val="26"/>
         </w:rPr>
       </w:pPr>
+    </w:p>
+    <w:p>
+      <w:pPr>
+        <w:pStyle w:val="Titolo2"/>
+        <w:rPr>
+          <w:rFonts w:ascii="Montserrat" w:hAnsi="Montserrat"/>
+          <w:color w:val="CC1903"/>
+          <w:sz w:val="36"/>
+          <w:szCs w:val="36"/>
+        </w:rPr>
+      </w:pPr>
+      <w:bookmarkStart w:id="13" w:name="_Toc222162205"/>
+      <w:r>
+        <w:rPr>
+          <w:rFonts w:ascii="Montserrat" w:hAnsi="Montserrat"/>
+          <w:color w:val="CC1903"/>
+          <w:sz w:val="36"/>
+          <w:szCs w:val="36"/>
+        </w:rPr>
+        <w:t>3. Progettazione</w:t>
+      </w:r>
+      <w:bookmarkEnd w:id="13"/>
+    </w:p>
+    <w:p>
+      <w:pPr>
+        <w:jc w:val="both"/>
+        <w:rPr>
+          <w:rFonts w:ascii="Montserrat" w:hAnsi="Montserrat"/>
+          <w:color w:val="272728"/>
+          <w:sz w:val="24"/>
+          <w:szCs w:val="24"/>
+        </w:rPr>
+      </w:pPr>
+      <w:r>
+        <w:rPr>
+          <w:rFonts w:ascii="Montserrat" w:hAnsi="Montserrat"/>
+          <w:color w:val="272728"/>
+          <w:sz w:val="24"/>
+          <w:szCs w:val="24"/>
+        </w:rPr>
+        <w:t>In questa fase ci si concentra sui diagrammi di sequenza/comunicazione</w:t>
+      </w:r>
+      <w:r>
+        <w:rPr>
+          <w:rFonts w:ascii="Montserrat" w:hAnsi="Montserrat"/>
+          <w:color w:val="272728"/>
+          <w:sz w:val="24"/>
+          <w:szCs w:val="24"/>
+        </w:rPr>
+        <w:t>, che mostrano come gli oggetti collaborano tra loro,</w:t>
+      </w:r>
+      <w:r>
+        <w:rPr>
+          <w:rFonts w:ascii="Montserrat" w:hAnsi="Montserrat"/>
+          <w:color w:val="272728"/>
+          <w:sz w:val="24"/>
+          <w:szCs w:val="24"/>
+        </w:rPr>
+        <w:t xml:space="preserve"> e sul Diagramma delle </w:t>
+      </w:r>
+      <w:r>
+        <w:rPr>
+          <w:rFonts w:ascii="Montserrat" w:hAnsi="Montserrat"/>
+          <w:color w:val="272728"/>
+          <w:sz w:val="24"/>
+          <w:szCs w:val="24"/>
+        </w:rPr>
+        <w:t>C</w:t>
+      </w:r>
+      <w:r>
+        <w:rPr>
+          <w:rFonts w:ascii="Montserrat" w:hAnsi="Montserrat"/>
+          <w:color w:val="272728"/>
+          <w:sz w:val="24"/>
+          <w:szCs w:val="24"/>
+        </w:rPr>
+        <w:t>lassi</w:t>
+      </w:r>
+      <w:r>
+        <w:rPr>
+          <w:rFonts w:ascii="Montserrat" w:hAnsi="Montserrat"/>
+          <w:color w:val="272728"/>
+          <w:sz w:val="24"/>
+          <w:szCs w:val="24"/>
+        </w:rPr>
+        <w:t xml:space="preserve"> di Progetto (DCD) che ci permette di ottenere una rappresentazione statica e dettagliata del sistema </w:t>
+      </w:r>
+      <w:proofErr w:type="spellStart"/>
+      <w:r>
+        <w:rPr>
+          <w:rFonts w:ascii="Montserrat" w:hAnsi="Montserrat"/>
+          <w:color w:val="272728"/>
+          <w:sz w:val="24"/>
+          <w:szCs w:val="24"/>
+        </w:rPr>
+        <w:t>CulturalFlow</w:t>
+      </w:r>
+      <w:proofErr w:type="spellEnd"/>
+      <w:r>
+        <w:rPr>
+          <w:rFonts w:ascii="Montserrat" w:hAnsi="Montserrat"/>
+          <w:color w:val="272728"/>
+          <w:sz w:val="24"/>
+          <w:szCs w:val="24"/>
+        </w:rPr>
+        <w:t>.</w:t>
+      </w:r>
+    </w:p>
+    <w:p>
+      <w:pPr>
+        <w:pStyle w:val="Titolo3"/>
+        <w:rPr>
+          <w:rFonts w:ascii="Montserrat" w:hAnsi="Montserrat"/>
+          <w:color w:val="CC1903"/>
+        </w:rPr>
+      </w:pPr>
+      <w:bookmarkStart w:id="14" w:name="_Toc222162206"/>
+      <w:r>
+        <w:rPr>
+          <w:rFonts w:ascii="Montserrat" w:hAnsi="Montserrat"/>
+          <w:color w:val="CC1903"/>
+        </w:rPr>
+        <w:t>3.1. Caso d’uso di avviamento, diagramma di comunicazione</w:t>
+      </w:r>
+      <w:bookmarkEnd w:id="14"/>
+    </w:p>
+    <w:p>
+      <w:pPr>
+        <w:jc w:val="both"/>
+        <w:rPr>
+          <w:rFonts w:ascii="Montserrat" w:hAnsi="Montserrat"/>
+          <w:b/>
+          <w:bCs/>
+          <w:i/>
+          <w:iCs/>
+          <w:color w:val="272728"/>
+          <w:sz w:val="24"/>
+          <w:szCs w:val="24"/>
+        </w:rPr>
+      </w:pPr>
+      <w:r>
+        <w:rPr>
+          <w:rFonts w:ascii="Montserrat" w:hAnsi="Montserrat"/>
+          <w:color w:val="272728"/>
+          <w:sz w:val="24"/>
+          <w:szCs w:val="24"/>
+        </w:rPr>
+        <w:t xml:space="preserve">Per funzionare correttamente, il sistema dovrà seguire dei passaggi iniziali di configurazione. </w:t>
+      </w:r>
+    </w:p>
+    <w:p>
+      <w:pPr>
+        <w:jc w:val="center"/>
+        <w:rPr>
+          <w:rFonts w:ascii="Montserrat" w:hAnsi="Montserrat"/>
+          <w:color w:val="272728"/>
+          <w:sz w:val="24"/>
+          <w:szCs w:val="24"/>
+        </w:rPr>
+      </w:pPr>
+      <w:r>
+        <w:rPr>
+          <w:rFonts w:ascii="Montserrat" w:hAnsi="Montserrat"/>
+          <w:noProof/>
+          <w:color w:val="272728"/>
+          <w:sz w:val="24"/>
+          <w:szCs w:val="24"/>
+        </w:rPr>
+        <w:lastRenderedPageBreak/>
+        <w:drawing>
+          <wp:inline distT="0" distB="0" distL="0" distR="0" wp14:anchorId="53D88B39" wp14:editId="13632906">
+            <wp:extent cx="5817184" cy="4170150"/>
+            <wp:effectExtent l="0" t="0" r="0" b="1905"/>
+            <wp:docPr id="90574821" name="Immagine 1"/>
+            <wp:cNvGraphicFramePr>
+              <a:graphicFrameLocks xmlns:a="http://schemas.openxmlformats.org/drawingml/2006/main" noChangeAspect="1"/>
+            </wp:cNvGraphicFramePr>
+            <a:graphic xmlns:a="http://schemas.openxmlformats.org/drawingml/2006/main">
+              <a:graphicData uri="http://schemas.openxmlformats.org/drawingml/2006/picture">
+                <pic:pic xmlns:pic="http://schemas.openxmlformats.org/drawingml/2006/picture">
+                  <pic:nvPicPr>
+                    <pic:cNvPr id="90574821" name="Immagine 1"/>
+                    <pic:cNvPicPr/>
+                  </pic:nvPicPr>
+                  <pic:blipFill>
+                    <a:blip r:embed="rId10">
+                      <a:extLst>
+                        <a:ext uri="{28A0092B-C50C-407E-A947-70E740481C1C}">
+                          <a14:useLocalDpi xmlns:a14="http://schemas.microsoft.com/office/drawing/2010/main" val="0"/>
+                        </a:ext>
+                      </a:extLst>
+                    </a:blip>
+                    <a:stretch>
+                      <a:fillRect/>
+                    </a:stretch>
+                  </pic:blipFill>
+                  <pic:spPr>
+                    <a:xfrm>
+                      <a:off x="0" y="0"/>
+                      <a:ext cx="5817184" cy="4170150"/>
+                    </a:xfrm>
+                    <a:prstGeom prst="rect">
+                      <a:avLst/>
+                    </a:prstGeom>
+                  </pic:spPr>
+                </pic:pic>
+              </a:graphicData>
+            </a:graphic>
+          </wp:inline>
+        </w:drawing>
+      </w:r>
+    </w:p>
+    <w:p>
+      <w:pPr>
+        <w:pStyle w:val="Titolo3"/>
+        <w:rPr>
+          <w:rFonts w:ascii="Montserrat" w:hAnsi="Montserrat"/>
+          <w:color w:val="CC1903"/>
+        </w:rPr>
+      </w:pPr>
+      <w:bookmarkStart w:id="15" w:name="_Toc222162207"/>
+      <w:r>
+        <w:rPr>
+          <w:rFonts w:ascii="Montserrat" w:hAnsi="Montserrat"/>
+          <w:color w:val="CC1903"/>
+        </w:rPr>
+        <w:t>3.2. Diagrammi di sequenza UC1</w:t>
+      </w:r>
+      <w:bookmarkEnd w:id="15"/>
+    </w:p>
+    <w:p>
+      <w:pPr>
+        <w:jc w:val="both"/>
+        <w:rPr>
+          <w:rFonts w:ascii="Montserrat" w:hAnsi="Montserrat"/>
+          <w:color w:val="272728"/>
+          <w:sz w:val="24"/>
+          <w:szCs w:val="24"/>
+        </w:rPr>
+      </w:pPr>
+      <w:r>
+        <w:rPr>
+          <w:rFonts w:ascii="Montserrat" w:hAnsi="Montserrat"/>
+          <w:color w:val="272728"/>
+          <w:sz w:val="24"/>
+          <w:szCs w:val="24"/>
+        </w:rPr>
+        <w:t xml:space="preserve">In questi primi diagrammi di sequenza, relativi al caso d’uso UC1, vengono applicati diversi pattern GRASP. Il primo da individuare è il </w:t>
+      </w:r>
+      <w:r>
+        <w:rPr>
+          <w:rFonts w:ascii="Montserrat" w:hAnsi="Montserrat"/>
+          <w:i/>
+          <w:iCs/>
+          <w:color w:val="272728"/>
+          <w:sz w:val="24"/>
+          <w:szCs w:val="24"/>
+        </w:rPr>
+        <w:t>pattern Controller</w:t>
+      </w:r>
+      <w:r>
+        <w:rPr>
+          <w:rFonts w:ascii="Montserrat" w:hAnsi="Montserrat"/>
+          <w:color w:val="272728"/>
+          <w:sz w:val="24"/>
+          <w:szCs w:val="24"/>
+        </w:rPr>
+        <w:t xml:space="preserve">. Essendo che stiamo considerando un sistema poco complesso con poche operazioni di sistema, si è scelto di utilizzare un </w:t>
+      </w:r>
+      <w:proofErr w:type="spellStart"/>
+      <w:r>
+        <w:rPr>
+          <w:rFonts w:ascii="Montserrat" w:hAnsi="Montserrat"/>
+          <w:i/>
+          <w:iCs/>
+          <w:color w:val="272728"/>
+          <w:sz w:val="24"/>
+          <w:szCs w:val="24"/>
+        </w:rPr>
+        <w:t>Facade</w:t>
+      </w:r>
+      <w:proofErr w:type="spellEnd"/>
+      <w:r>
+        <w:rPr>
+          <w:rFonts w:ascii="Montserrat" w:hAnsi="Montserrat"/>
+          <w:i/>
+          <w:iCs/>
+          <w:color w:val="272728"/>
+          <w:sz w:val="24"/>
+          <w:szCs w:val="24"/>
+        </w:rPr>
+        <w:t xml:space="preserve"> Controller</w:t>
+      </w:r>
+      <w:r>
+        <w:rPr>
+          <w:rFonts w:ascii="Montserrat" w:hAnsi="Montserrat"/>
+          <w:color w:val="272728"/>
+          <w:sz w:val="24"/>
+          <w:szCs w:val="24"/>
+        </w:rPr>
+        <w:t xml:space="preserve"> che è rappresentato proprio dal sistema </w:t>
+      </w:r>
+      <w:proofErr w:type="spellStart"/>
+      <w:r>
+        <w:rPr>
+          <w:rFonts w:ascii="Montserrat" w:hAnsi="Montserrat"/>
+          <w:color w:val="272728"/>
+          <w:sz w:val="24"/>
+          <w:szCs w:val="24"/>
+        </w:rPr>
+        <w:t>CulturalFlow</w:t>
+      </w:r>
+      <w:proofErr w:type="spellEnd"/>
+      <w:r>
+        <w:rPr>
+          <w:rFonts w:ascii="Montserrat" w:hAnsi="Montserrat"/>
+          <w:color w:val="272728"/>
+          <w:sz w:val="24"/>
+          <w:szCs w:val="24"/>
+        </w:rPr>
+        <w:t xml:space="preserve">. </w:t>
+      </w:r>
+      <w:r>
+        <w:rPr>
+          <w:rFonts w:ascii="Montserrat" w:hAnsi="Montserrat"/>
+          <w:color w:val="272728"/>
+          <w:sz w:val="24"/>
+          <w:szCs w:val="24"/>
+        </w:rPr>
+        <w:t xml:space="preserve">Il sistema utilizza </w:t>
+      </w:r>
+      <w:proofErr w:type="spellStart"/>
+      <w:r>
+        <w:rPr>
+          <w:rFonts w:ascii="Montserrat" w:hAnsi="Montserrat"/>
+          <w:color w:val="272728"/>
+          <w:sz w:val="24"/>
+          <w:szCs w:val="24"/>
+        </w:rPr>
+        <w:t>CulturalFlow</w:t>
+      </w:r>
+      <w:proofErr w:type="spellEnd"/>
+      <w:r>
+        <w:rPr>
+          <w:rFonts w:ascii="Montserrat" w:hAnsi="Montserrat"/>
+          <w:color w:val="272728"/>
+          <w:sz w:val="24"/>
+          <w:szCs w:val="24"/>
+        </w:rPr>
+        <w:t xml:space="preserve"> come unico punto di accesso per le operazioni provenienti dall’interfaccia utente. </w:t>
+      </w:r>
+      <w:r>
+        <w:rPr>
+          <w:rFonts w:ascii="Montserrat" w:hAnsi="Montserrat"/>
+          <w:color w:val="272728"/>
+          <w:sz w:val="24"/>
+          <w:szCs w:val="24"/>
+        </w:rPr>
+        <w:t xml:space="preserve">Il sistema tiene, inoltre, traccia di tutti i Clienti che sono iscritti al suo interno, attraverso una mappa dei Clienti. Applicando il </w:t>
+      </w:r>
+      <w:r>
+        <w:rPr>
+          <w:rFonts w:ascii="Montserrat" w:hAnsi="Montserrat"/>
+          <w:i/>
+          <w:iCs/>
+          <w:color w:val="272728"/>
+          <w:sz w:val="24"/>
+          <w:szCs w:val="24"/>
+        </w:rPr>
+        <w:t>pattern Creator</w:t>
+      </w:r>
+      <w:r>
+        <w:rPr>
+          <w:rFonts w:ascii="Montserrat" w:hAnsi="Montserrat"/>
+          <w:color w:val="272728"/>
+          <w:sz w:val="24"/>
+          <w:szCs w:val="24"/>
+        </w:rPr>
+        <w:t xml:space="preserve">, il Sistema ha, dunque, il compito di creare nuovi oggetti di tipo Cliente. È stato utilizzato anche il </w:t>
+      </w:r>
+      <w:r>
+        <w:rPr>
+          <w:rFonts w:ascii="Montserrat" w:hAnsi="Montserrat"/>
+          <w:i/>
+          <w:iCs/>
+          <w:color w:val="272728"/>
+          <w:sz w:val="24"/>
+          <w:szCs w:val="24"/>
+        </w:rPr>
+        <w:t>pattern Information Expert</w:t>
+      </w:r>
+      <w:r>
+        <w:rPr>
+          <w:rFonts w:ascii="Montserrat" w:hAnsi="Montserrat"/>
+          <w:color w:val="272728"/>
+          <w:sz w:val="24"/>
+          <w:szCs w:val="24"/>
+        </w:rPr>
+        <w:t xml:space="preserve"> per trovare eventuali Clienti già iscritti</w:t>
+      </w:r>
+      <w:r>
+        <w:rPr>
+          <w:rFonts w:ascii="Montserrat" w:hAnsi="Montserrat"/>
+          <w:color w:val="272728"/>
+          <w:sz w:val="24"/>
+          <w:szCs w:val="24"/>
+        </w:rPr>
+        <w:t>, permettendoci così di assegnare le responsabilità alle classi che possiedono le informazioni necessarie per portarle a termine.</w:t>
+      </w:r>
+    </w:p>
+    <w:p>
+      <w:pPr>
+        <w:jc w:val="both"/>
+        <w:rPr>
+          <w:rFonts w:ascii="Montserrat" w:hAnsi="Montserrat"/>
+          <w:color w:val="272728"/>
+          <w:sz w:val="24"/>
+          <w:szCs w:val="24"/>
+        </w:rPr>
+      </w:pPr>
+    </w:p>
+    <w:p>
+      <w:pPr>
+        <w:jc w:val="both"/>
+        <w:rPr>
+          <w:rFonts w:ascii="Montserrat" w:hAnsi="Montserrat"/>
+          <w:color w:val="272728"/>
+          <w:sz w:val="24"/>
+          <w:szCs w:val="24"/>
+        </w:rPr>
+      </w:pPr>
+    </w:p>
+    <w:p>
+      <w:pPr>
+        <w:jc w:val="both"/>
+        <w:rPr>
+          <w:rFonts w:ascii="Montserrat" w:hAnsi="Montserrat"/>
+          <w:color w:val="272728"/>
+          <w:sz w:val="24"/>
+          <w:szCs w:val="24"/>
+        </w:rPr>
+      </w:pPr>
+    </w:p>
+    <w:p>
+      <w:pPr>
+        <w:jc w:val="both"/>
+        <w:rPr>
+          <w:rFonts w:ascii="Montserrat" w:hAnsi="Montserrat"/>
+          <w:color w:val="272728"/>
+          <w:sz w:val="24"/>
+          <w:szCs w:val="24"/>
+        </w:rPr>
+      </w:pPr>
+    </w:p>
+    <w:p>
+      <w:pPr>
+        <w:jc w:val="both"/>
+        <w:rPr>
+          <w:rFonts w:ascii="Montserrat" w:hAnsi="Montserrat"/>
+          <w:color w:val="272728"/>
+          <w:sz w:val="24"/>
+          <w:szCs w:val="24"/>
+        </w:rPr>
+      </w:pPr>
+    </w:p>
+    <w:p>
+      <w:pPr>
+        <w:jc w:val="both"/>
+        <w:rPr>
+          <w:rFonts w:ascii="Montserrat" w:hAnsi="Montserrat"/>
+          <w:color w:val="272728"/>
+          <w:sz w:val="24"/>
+          <w:szCs w:val="24"/>
+        </w:rPr>
+      </w:pPr>
+    </w:p>
+    <w:p>
+      <w:pPr>
+        <w:pStyle w:val="Titolo4"/>
+        <w:rPr>
+          <w:rFonts w:ascii="Montserrat" w:hAnsi="Montserrat"/>
+          <w:i w:val="0"/>
+          <w:iCs w:val="0"/>
+          <w:color w:val="CC1903"/>
+          <w:sz w:val="26"/>
+          <w:szCs w:val="26"/>
+        </w:rPr>
+      </w:pPr>
+      <w:bookmarkStart w:id="16" w:name="_Toc222162208"/>
+      <w:r>
+        <w:rPr>
+          <w:rFonts w:ascii="Montserrat" w:hAnsi="Montserrat"/>
+          <w:i w:val="0"/>
+          <w:iCs w:val="0"/>
+          <w:color w:val="CC1903"/>
+          <w:sz w:val="26"/>
+          <w:szCs w:val="26"/>
+        </w:rPr>
+        <w:lastRenderedPageBreak/>
+        <w:t xml:space="preserve">3.2.1. </w:t>
+      </w:r>
+      <w:proofErr w:type="spellStart"/>
+      <w:proofErr w:type="gramStart"/>
+      <w:r>
+        <w:rPr>
+          <w:rFonts w:ascii="Montserrat" w:hAnsi="Montserrat"/>
+          <w:i w:val="0"/>
+          <w:iCs w:val="0"/>
+          <w:color w:val="CC1903"/>
+          <w:sz w:val="26"/>
+          <w:szCs w:val="26"/>
+        </w:rPr>
+        <w:t>inserisciDati</w:t>
+      </w:r>
+      <w:proofErr w:type="spellEnd"/>
+      <w:r>
+        <w:rPr>
+          <w:rFonts w:ascii="Montserrat" w:hAnsi="Montserrat"/>
+          <w:i w:val="0"/>
+          <w:iCs w:val="0"/>
+          <w:color w:val="CC1903"/>
+          <w:sz w:val="26"/>
+          <w:szCs w:val="26"/>
+        </w:rPr>
+        <w:t>(</w:t>
+      </w:r>
+      <w:proofErr w:type="gramEnd"/>
+      <w:r>
+        <w:rPr>
+          <w:rFonts w:ascii="Montserrat" w:hAnsi="Montserrat"/>
+          <w:i w:val="0"/>
+          <w:iCs w:val="0"/>
+          <w:color w:val="CC1903"/>
+          <w:sz w:val="26"/>
+          <w:szCs w:val="26"/>
+        </w:rPr>
+        <w:t>)</w:t>
+      </w:r>
+      <w:bookmarkEnd w:id="16"/>
+    </w:p>
+    <w:p>
+      <w:pPr>
+        <w:jc w:val="center"/>
+        <w:rPr>
+          <w:rFonts w:ascii="Montserrat" w:hAnsi="Montserrat"/>
+          <w:color w:val="CC1903"/>
+          <w:sz w:val="26"/>
+          <w:szCs w:val="26"/>
+        </w:rPr>
+      </w:pPr>
+      <w:r>
+        <w:rPr>
+          <w:rFonts w:ascii="Montserrat" w:hAnsi="Montserrat"/>
+          <w:noProof/>
+          <w:color w:val="CC1903"/>
+          <w:sz w:val="26"/>
+          <w:szCs w:val="26"/>
+        </w:rPr>
+        <w:drawing>
+          <wp:inline distT="0" distB="0" distL="0" distR="0" wp14:anchorId="3BD78C1A" wp14:editId="12B25143">
+            <wp:extent cx="6119702" cy="3199765"/>
+            <wp:effectExtent l="0" t="0" r="0" b="635"/>
+            <wp:docPr id="362180710" name="Immagine 5"/>
+            <wp:cNvGraphicFramePr>
+              <a:graphicFrameLocks xmlns:a="http://schemas.openxmlformats.org/drawingml/2006/main" noChangeAspect="1"/>
+            </wp:cNvGraphicFramePr>
+            <a:graphic xmlns:a="http://schemas.openxmlformats.org/drawingml/2006/main">
+              <a:graphicData uri="http://schemas.openxmlformats.org/drawingml/2006/picture">
+                <pic:pic xmlns:pic="http://schemas.openxmlformats.org/drawingml/2006/picture">
+                  <pic:nvPicPr>
+                    <pic:cNvPr id="362180710" name="Immagine 5"/>
+                    <pic:cNvPicPr/>
+                  </pic:nvPicPr>
+                  <pic:blipFill>
+                    <a:blip r:embed="rId11" cstate="print">
+                      <a:extLst>
+                        <a:ext uri="{28A0092B-C50C-407E-A947-70E740481C1C}">
+                          <a14:useLocalDpi xmlns:a14="http://schemas.microsoft.com/office/drawing/2010/main" val="0"/>
+                        </a:ext>
+                      </a:extLst>
+                    </a:blip>
+                    <a:stretch>
+                      <a:fillRect/>
+                    </a:stretch>
+                  </pic:blipFill>
+                  <pic:spPr>
+                    <a:xfrm>
+                      <a:off x="0" y="0"/>
+                      <a:ext cx="6119702" cy="3199765"/>
+                    </a:xfrm>
+                    <a:prstGeom prst="rect">
+                      <a:avLst/>
+                    </a:prstGeom>
+                  </pic:spPr>
+                </pic:pic>
+              </a:graphicData>
+            </a:graphic>
+          </wp:inline>
+        </w:drawing>
+      </w:r>
+    </w:p>
+    <w:p>
+      <w:pPr>
+        <w:pStyle w:val="Titolo4"/>
+        <w:rPr>
+          <w:rFonts w:ascii="Montserrat" w:hAnsi="Montserrat"/>
+          <w:i w:val="0"/>
+          <w:iCs w:val="0"/>
+          <w:color w:val="CC1903"/>
+          <w:sz w:val="26"/>
+          <w:szCs w:val="26"/>
+        </w:rPr>
+      </w:pPr>
+      <w:bookmarkStart w:id="17" w:name="_Toc222162209"/>
+      <w:r>
+        <w:rPr>
+          <w:rFonts w:ascii="Montserrat" w:hAnsi="Montserrat"/>
+          <w:i w:val="0"/>
+          <w:iCs w:val="0"/>
+          <w:color w:val="CC1903"/>
+          <w:sz w:val="26"/>
+          <w:szCs w:val="26"/>
+        </w:rPr>
+        <w:t xml:space="preserve">3.2.2. </w:t>
+      </w:r>
+      <w:proofErr w:type="spellStart"/>
+      <w:proofErr w:type="gramStart"/>
+      <w:r>
+        <w:rPr>
+          <w:rFonts w:ascii="Montserrat" w:hAnsi="Montserrat"/>
+          <w:i w:val="0"/>
+          <w:iCs w:val="0"/>
+          <w:color w:val="CC1903"/>
+          <w:sz w:val="26"/>
+          <w:szCs w:val="26"/>
+        </w:rPr>
+        <w:t>confermaRegistrazione</w:t>
+      </w:r>
+      <w:proofErr w:type="spellEnd"/>
+      <w:r>
+        <w:rPr>
+          <w:rFonts w:ascii="Montserrat" w:hAnsi="Montserrat"/>
+          <w:i w:val="0"/>
+          <w:iCs w:val="0"/>
+          <w:color w:val="CC1903"/>
+          <w:sz w:val="26"/>
+          <w:szCs w:val="26"/>
+        </w:rPr>
+        <w:t>(</w:t>
+      </w:r>
+      <w:proofErr w:type="gramEnd"/>
+      <w:r>
+        <w:rPr>
+          <w:rFonts w:ascii="Montserrat" w:hAnsi="Montserrat"/>
+          <w:i w:val="0"/>
+          <w:iCs w:val="0"/>
+          <w:color w:val="CC1903"/>
+          <w:sz w:val="26"/>
+          <w:szCs w:val="26"/>
+        </w:rPr>
+        <w:t>)</w:t>
+      </w:r>
+      <w:bookmarkEnd w:id="17"/>
+    </w:p>
+    <w:p>
+      <w:pPr>
+        <w:jc w:val="center"/>
+        <w:rPr>
+          <w:rFonts w:ascii="Montserrat" w:hAnsi="Montserrat"/>
+          <w:color w:val="CC1903"/>
+          <w:sz w:val="26"/>
+          <w:szCs w:val="26"/>
+        </w:rPr>
+      </w:pPr>
+      <w:r>
+        <w:rPr>
+          <w:rFonts w:ascii="Montserrat" w:hAnsi="Montserrat"/>
+          <w:noProof/>
+          <w:color w:val="CC1903"/>
+          <w:sz w:val="26"/>
+          <w:szCs w:val="26"/>
+        </w:rPr>
+        <w:drawing>
+          <wp:inline distT="0" distB="0" distL="0" distR="0" wp14:anchorId="6EB0B0AB" wp14:editId="0C4FCEF6">
+            <wp:extent cx="6120028" cy="2995930"/>
+            <wp:effectExtent l="0" t="0" r="0" b="0"/>
+            <wp:docPr id="651129621" name="Immagine 6"/>
+            <wp:cNvGraphicFramePr>
+              <a:graphicFrameLocks xmlns:a="http://schemas.openxmlformats.org/drawingml/2006/main" noChangeAspect="1"/>
+            </wp:cNvGraphicFramePr>
+            <a:graphic xmlns:a="http://schemas.openxmlformats.org/drawingml/2006/main">
+              <a:graphicData uri="http://schemas.openxmlformats.org/drawingml/2006/picture">
+                <pic:pic xmlns:pic="http://schemas.openxmlformats.org/drawingml/2006/picture">
+                  <pic:nvPicPr>
+                    <pic:cNvPr id="651129621" name="Immagine 6"/>
+                    <pic:cNvPicPr/>
+                  </pic:nvPicPr>
+                  <pic:blipFill>
+                    <a:blip r:embed="rId12">
+                      <a:extLst>
+                        <a:ext uri="{28A0092B-C50C-407E-A947-70E740481C1C}">
+                          <a14:useLocalDpi xmlns:a14="http://schemas.microsoft.com/office/drawing/2010/main" val="0"/>
+                        </a:ext>
+                      </a:extLst>
+                    </a:blip>
+                    <a:stretch>
+                      <a:fillRect/>
+                    </a:stretch>
+                  </pic:blipFill>
+                  <pic:spPr>
+                    <a:xfrm>
+                      <a:off x="0" y="0"/>
+                      <a:ext cx="6120028" cy="2995930"/>
+                    </a:xfrm>
+                    <a:prstGeom prst="rect">
+                      <a:avLst/>
+                    </a:prstGeom>
+                  </pic:spPr>
+                </pic:pic>
+              </a:graphicData>
+            </a:graphic>
+          </wp:inline>
+        </w:drawing>
+      </w:r>
+    </w:p>
+    <w:p>
+      <w:pPr>
+        <w:pStyle w:val="Titolo2"/>
+        <w:rPr>
+          <w:rFonts w:ascii="Montserrat" w:hAnsi="Montserrat"/>
+          <w:color w:val="CC1903"/>
+          <w:sz w:val="28"/>
+          <w:szCs w:val="28"/>
+        </w:rPr>
+      </w:pPr>
+      <w:bookmarkStart w:id="18" w:name="_Toc222162210"/>
+      <w:r>
+        <w:rPr>
+          <w:rFonts w:ascii="Montserrat" w:hAnsi="Montserrat"/>
+          <w:color w:val="CC1903"/>
+          <w:sz w:val="28"/>
+          <w:szCs w:val="28"/>
+        </w:rPr>
+        <w:t>3.3. Diagrammi di Sequenza UC2</w:t>
+      </w:r>
+      <w:bookmarkEnd w:id="18"/>
+    </w:p>
+    <w:p>
+      <w:pPr>
+        <w:jc w:val="both"/>
+        <w:rPr>
+          <w:rFonts w:ascii="Montserrat" w:hAnsi="Montserrat"/>
+          <w:color w:val="272728"/>
+          <w:sz w:val="24"/>
+          <w:szCs w:val="24"/>
+        </w:rPr>
+      </w:pPr>
+      <w:r>
+        <w:rPr>
+          <w:rFonts w:ascii="Montserrat" w:hAnsi="Montserrat"/>
+          <w:color w:val="272728"/>
+          <w:sz w:val="24"/>
+          <w:szCs w:val="24"/>
+        </w:rPr>
+        <w:t xml:space="preserve">In questo secondo caso d’uso, viene applicato il </w:t>
+      </w:r>
+      <w:r>
+        <w:rPr>
+          <w:rFonts w:ascii="Montserrat" w:hAnsi="Montserrat"/>
+          <w:i/>
+          <w:iCs/>
+          <w:color w:val="272728"/>
+          <w:sz w:val="24"/>
+          <w:szCs w:val="24"/>
+        </w:rPr>
+        <w:t>pattern Builder</w:t>
+      </w:r>
+      <w:r>
+        <w:rPr>
+          <w:rFonts w:ascii="Montserrat" w:hAnsi="Montserrat"/>
+          <w:color w:val="272728"/>
+          <w:sz w:val="24"/>
+          <w:szCs w:val="24"/>
+        </w:rPr>
+        <w:t xml:space="preserve">, che è uno dei pattern </w:t>
+      </w:r>
+      <w:proofErr w:type="spellStart"/>
+      <w:r>
+        <w:rPr>
+          <w:rFonts w:ascii="Montserrat" w:hAnsi="Montserrat"/>
+          <w:color w:val="272728"/>
+          <w:sz w:val="24"/>
+          <w:szCs w:val="24"/>
+        </w:rPr>
+        <w:t>creazionali</w:t>
+      </w:r>
+      <w:proofErr w:type="spellEnd"/>
+      <w:r>
+        <w:rPr>
+          <w:rFonts w:ascii="Montserrat" w:hAnsi="Montserrat"/>
+          <w:color w:val="272728"/>
+          <w:sz w:val="24"/>
+          <w:szCs w:val="24"/>
+        </w:rPr>
+        <w:t xml:space="preserve"> </w:t>
+      </w:r>
+      <w:proofErr w:type="spellStart"/>
+      <w:r>
+        <w:rPr>
+          <w:rFonts w:ascii="Montserrat" w:hAnsi="Montserrat"/>
+          <w:color w:val="272728"/>
+          <w:sz w:val="24"/>
+          <w:szCs w:val="24"/>
+        </w:rPr>
+        <w:t>GoF</w:t>
+      </w:r>
+      <w:proofErr w:type="spellEnd"/>
+      <w:r>
+        <w:rPr>
+          <w:rFonts w:ascii="Montserrat" w:hAnsi="Montserrat"/>
+          <w:color w:val="272728"/>
+          <w:sz w:val="24"/>
+          <w:szCs w:val="24"/>
+        </w:rPr>
+        <w:t xml:space="preserve">. Questo pattern viene applicato per la creazione dell’oggetto complesso Evento. Questo pattern ci permette di costruire l’oggetto passo dopo passo, separando la logica di costruzione dalla rappresentazione finale del prodotto (l’evento). Anche in questo caso è </w:t>
+      </w:r>
+      <w:proofErr w:type="spellStart"/>
+      <w:r>
+        <w:rPr>
+          <w:rFonts w:ascii="Montserrat" w:hAnsi="Montserrat"/>
+          <w:color w:val="272728"/>
+          <w:sz w:val="24"/>
+          <w:szCs w:val="24"/>
+        </w:rPr>
+        <w:t>CulturalFlow</w:t>
+      </w:r>
+      <w:proofErr w:type="spellEnd"/>
+      <w:r>
+        <w:rPr>
+          <w:rFonts w:ascii="Montserrat" w:hAnsi="Montserrat"/>
+          <w:color w:val="272728"/>
+          <w:sz w:val="24"/>
+          <w:szCs w:val="24"/>
+        </w:rPr>
+        <w:t xml:space="preserve"> che avrà il compito di creare le istanze di Evento, chiaramente tramite il supporto di un builder dedicato.</w:t>
+      </w:r>
+    </w:p>
+    <w:p>
+      <w:pPr>
+        <w:jc w:val="both"/>
+        <w:rPr>
+          <w:rFonts w:ascii="Montserrat" w:hAnsi="Montserrat"/>
+          <w:color w:val="272728"/>
+          <w:sz w:val="24"/>
+          <w:szCs w:val="24"/>
+        </w:rPr>
+      </w:pPr>
+    </w:p>
+    <w:p>
+      <w:pPr>
+        <w:pStyle w:val="Titolo4"/>
+        <w:rPr>
+          <w:rFonts w:ascii="Montserrat" w:hAnsi="Montserrat"/>
+          <w:i w:val="0"/>
+          <w:iCs w:val="0"/>
+          <w:color w:val="CC1903"/>
+          <w:sz w:val="26"/>
+          <w:szCs w:val="26"/>
+        </w:rPr>
+      </w:pPr>
+      <w:bookmarkStart w:id="19" w:name="_Toc222162211"/>
+      <w:r>
+        <w:rPr>
+          <w:rFonts w:ascii="Montserrat" w:hAnsi="Montserrat"/>
+          <w:i w:val="0"/>
+          <w:iCs w:val="0"/>
+          <w:color w:val="CC1903"/>
+          <w:sz w:val="26"/>
+          <w:szCs w:val="26"/>
+        </w:rPr>
+        <w:lastRenderedPageBreak/>
+        <w:t>3.3.1.</w:t>
+      </w:r>
+      <w:r>
+        <w:rPr>
+          <w:rFonts w:ascii="Montserrat" w:hAnsi="Montserrat"/>
+          <w:i w:val="0"/>
+          <w:iCs w:val="0"/>
+          <w:color w:val="CC1903"/>
+          <w:sz w:val="26"/>
+          <w:szCs w:val="26"/>
+        </w:rPr>
+        <w:t xml:space="preserve"> </w:t>
+      </w:r>
+      <w:proofErr w:type="spellStart"/>
+      <w:proofErr w:type="gramStart"/>
+      <w:r>
+        <w:rPr>
+          <w:rFonts w:ascii="Montserrat" w:hAnsi="Montserrat"/>
+          <w:i w:val="0"/>
+          <w:iCs w:val="0"/>
+          <w:color w:val="CC1903"/>
+          <w:sz w:val="26"/>
+          <w:szCs w:val="26"/>
+        </w:rPr>
+        <w:t>inserisciEvento</w:t>
+      </w:r>
+      <w:proofErr w:type="spellEnd"/>
+      <w:r>
+        <w:rPr>
+          <w:rFonts w:ascii="Montserrat" w:hAnsi="Montserrat"/>
+          <w:i w:val="0"/>
+          <w:iCs w:val="0"/>
+          <w:color w:val="CC1903"/>
+          <w:sz w:val="26"/>
+          <w:szCs w:val="26"/>
+        </w:rPr>
+        <w:t>(</w:t>
+      </w:r>
+      <w:proofErr w:type="gramEnd"/>
+      <w:r>
+        <w:rPr>
+          <w:rFonts w:ascii="Montserrat" w:hAnsi="Montserrat"/>
+          <w:i w:val="0"/>
+          <w:iCs w:val="0"/>
+          <w:color w:val="CC1903"/>
+          <w:sz w:val="26"/>
+          <w:szCs w:val="26"/>
+        </w:rPr>
+        <w:t>)</w:t>
+      </w:r>
+      <w:bookmarkEnd w:id="19"/>
+    </w:p>
+    <w:p>
+      <w:pPr>
+        <w:jc w:val="center"/>
+        <w:rPr>
+          <w:rFonts w:ascii="Montserrat" w:hAnsi="Montserrat"/>
+          <w:color w:val="CC1903"/>
+          <w:sz w:val="26"/>
+          <w:szCs w:val="26"/>
+        </w:rPr>
+      </w:pPr>
+      <w:r>
+        <w:rPr>
+          <w:rFonts w:ascii="Montserrat" w:hAnsi="Montserrat"/>
+          <w:noProof/>
+          <w:color w:val="CC1903"/>
+          <w:sz w:val="26"/>
+          <w:szCs w:val="26"/>
+        </w:rPr>
+        <w:drawing>
+          <wp:inline distT="0" distB="0" distL="0" distR="0" wp14:anchorId="40E9F8CA" wp14:editId="40F24E51">
+            <wp:extent cx="5988889" cy="2396490"/>
+            <wp:effectExtent l="0" t="0" r="0" b="3810"/>
+            <wp:docPr id="775785694" name="Immagine 7"/>
+            <wp:cNvGraphicFramePr>
+              <a:graphicFrameLocks xmlns:a="http://schemas.openxmlformats.org/drawingml/2006/main" noChangeAspect="1"/>
+            </wp:cNvGraphicFramePr>
+            <a:graphic xmlns:a="http://schemas.openxmlformats.org/drawingml/2006/main">
+              <a:graphicData uri="http://schemas.openxmlformats.org/drawingml/2006/picture">
+                <pic:pic xmlns:pic="http://schemas.openxmlformats.org/drawingml/2006/picture">
+                  <pic:nvPicPr>
+                    <pic:cNvPr id="775785694" name="Immagine 7"/>
+                    <pic:cNvPicPr/>
+                  </pic:nvPicPr>
+                  <pic:blipFill>
+                    <a:blip r:embed="rId13">
+                      <a:extLst>
+                        <a:ext uri="{28A0092B-C50C-407E-A947-70E740481C1C}">
+                          <a14:useLocalDpi xmlns:a14="http://schemas.microsoft.com/office/drawing/2010/main" val="0"/>
+                        </a:ext>
+                      </a:extLst>
+                    </a:blip>
+                    <a:stretch>
+                      <a:fillRect/>
+                    </a:stretch>
+                  </pic:blipFill>
+                  <pic:spPr>
+                    <a:xfrm>
+                      <a:off x="0" y="0"/>
+                      <a:ext cx="5988889" cy="2396490"/>
+                    </a:xfrm>
+                    <a:prstGeom prst="rect">
+                      <a:avLst/>
+                    </a:prstGeom>
+                  </pic:spPr>
+                </pic:pic>
+              </a:graphicData>
+            </a:graphic>
+          </wp:inline>
+        </w:drawing>
+      </w:r>
+    </w:p>
+    <w:p>
+      <w:pPr>
+        <w:pStyle w:val="Titolo4"/>
+        <w:rPr>
+          <w:rFonts w:ascii="Montserrat" w:hAnsi="Montserrat"/>
+          <w:i w:val="0"/>
+          <w:iCs w:val="0"/>
+          <w:color w:val="CC1903"/>
+          <w:sz w:val="26"/>
+          <w:szCs w:val="26"/>
+        </w:rPr>
+      </w:pPr>
+      <w:bookmarkStart w:id="20" w:name="_Toc222162212"/>
+      <w:r>
+        <w:rPr>
+          <w:rFonts w:ascii="Montserrat" w:hAnsi="Montserrat"/>
+          <w:i w:val="0"/>
+          <w:iCs w:val="0"/>
+          <w:color w:val="CC1903"/>
+          <w:sz w:val="26"/>
+          <w:szCs w:val="26"/>
+        </w:rPr>
+        <w:t xml:space="preserve">3.3.2. </w:t>
+      </w:r>
+      <w:proofErr w:type="spellStart"/>
+      <w:proofErr w:type="gramStart"/>
+      <w:r>
+        <w:rPr>
+          <w:rFonts w:ascii="Montserrat" w:hAnsi="Montserrat"/>
+          <w:i w:val="0"/>
+          <w:iCs w:val="0"/>
+          <w:color w:val="CC1903"/>
+          <w:sz w:val="26"/>
+          <w:szCs w:val="26"/>
+        </w:rPr>
+        <w:t>selezionaTipologia</w:t>
+      </w:r>
+      <w:proofErr w:type="spellEnd"/>
+      <w:r>
+        <w:rPr>
+          <w:rFonts w:ascii="Montserrat" w:hAnsi="Montserrat"/>
+          <w:i w:val="0"/>
+          <w:iCs w:val="0"/>
+          <w:color w:val="CC1903"/>
+          <w:sz w:val="26"/>
+          <w:szCs w:val="26"/>
+        </w:rPr>
+        <w:t>(</w:t>
+      </w:r>
+      <w:proofErr w:type="gramEnd"/>
+      <w:r>
+        <w:rPr>
+          <w:rFonts w:ascii="Montserrat" w:hAnsi="Montserrat"/>
+          <w:i w:val="0"/>
+          <w:iCs w:val="0"/>
+          <w:color w:val="CC1903"/>
+          <w:sz w:val="26"/>
+          <w:szCs w:val="26"/>
+        </w:rPr>
+        <w:t>)</w:t>
+      </w:r>
+      <w:bookmarkEnd w:id="20"/>
+    </w:p>
+    <w:p>
+      <w:pPr>
+        <w:jc w:val="center"/>
+        <w:rPr>
+          <w:rFonts w:ascii="Montserrat" w:hAnsi="Montserrat"/>
+          <w:color w:val="CC1903"/>
+          <w:sz w:val="26"/>
+          <w:szCs w:val="26"/>
+        </w:rPr>
+      </w:pPr>
+      <w:r>
+        <w:rPr>
+          <w:rFonts w:ascii="Montserrat" w:hAnsi="Montserrat"/>
+          <w:noProof/>
+          <w:color w:val="CC1903"/>
+          <w:sz w:val="26"/>
+          <w:szCs w:val="26"/>
+        </w:rPr>
+        <w:drawing>
+          <wp:inline distT="0" distB="0" distL="0" distR="0" wp14:anchorId="5F0D6B9E" wp14:editId="781472D0">
+            <wp:extent cx="6120130" cy="2738120"/>
+            <wp:effectExtent l="0" t="0" r="0" b="5080"/>
+            <wp:docPr id="1617070776" name="Immagine 8" descr="Immagine che contiene testo, linea, diagramma, schermata&#10;&#10;Il contenuto generato dall'IA potrebbe non essere corretto."/>
+            <wp:cNvGraphicFramePr>
+              <a:graphicFrameLocks xmlns:a="http://schemas.openxmlformats.org/drawingml/2006/main" noChangeAspect="1"/>
+            </wp:cNvGraphicFramePr>
+            <a:graphic xmlns:a="http://schemas.openxmlformats.org/drawingml/2006/main">
+              <a:graphicData uri="http://schemas.openxmlformats.org/drawingml/2006/picture">
+                <pic:pic xmlns:pic="http://schemas.openxmlformats.org/drawingml/2006/picture">
+                  <pic:nvPicPr>
+                    <pic:cNvPr id="1617070776" name="Immagine 8" descr="Immagine che contiene testo, linea, diagramma, schermata&#10;&#10;Il contenuto generato dall'IA potrebbe non essere corretto."/>
+                    <pic:cNvPicPr/>
+                  </pic:nvPicPr>
+                  <pic:blipFill>
+                    <a:blip r:embed="rId14">
+                      <a:extLst>
+                        <a:ext uri="{28A0092B-C50C-407E-A947-70E740481C1C}">
+                          <a14:useLocalDpi xmlns:a14="http://schemas.microsoft.com/office/drawing/2010/main" val="0"/>
+                        </a:ext>
+                      </a:extLst>
+                    </a:blip>
+                    <a:stretch>
+                      <a:fillRect/>
+                    </a:stretch>
+                  </pic:blipFill>
+                  <pic:spPr>
+                    <a:xfrm>
+                      <a:off x="0" y="0"/>
+                      <a:ext cx="6120130" cy="2738120"/>
+                    </a:xfrm>
+                    <a:prstGeom prst="rect">
+                      <a:avLst/>
+                    </a:prstGeom>
+                  </pic:spPr>
+                </pic:pic>
+              </a:graphicData>
+            </a:graphic>
+          </wp:inline>
+        </w:drawing>
+      </w:r>
+    </w:p>
+    <w:p>
+      <w:pPr>
+        <w:pStyle w:val="Titolo4"/>
+        <w:rPr>
+          <w:rFonts w:ascii="Montserrat" w:hAnsi="Montserrat"/>
+          <w:i w:val="0"/>
+          <w:iCs w:val="0"/>
+          <w:color w:val="CC1903"/>
+          <w:sz w:val="26"/>
+          <w:szCs w:val="26"/>
+        </w:rPr>
+      </w:pPr>
+      <w:bookmarkStart w:id="21" w:name="_Toc222162213"/>
+      <w:r>
+        <w:rPr>
+          <w:rFonts w:ascii="Montserrat" w:hAnsi="Montserrat"/>
+          <w:i w:val="0"/>
+          <w:iCs w:val="0"/>
+          <w:color w:val="CC1903"/>
+          <w:sz w:val="26"/>
+          <w:szCs w:val="26"/>
+        </w:rPr>
+        <w:t>3.3.3.</w:t>
+      </w:r>
+      <w:r>
+        <w:rPr>
+          <w:rFonts w:ascii="Montserrat" w:hAnsi="Montserrat"/>
+          <w:i w:val="0"/>
+          <w:iCs w:val="0"/>
+          <w:color w:val="CC1903"/>
+          <w:sz w:val="26"/>
+          <w:szCs w:val="26"/>
+        </w:rPr>
+        <w:t xml:space="preserve"> </w:t>
+      </w:r>
+      <w:proofErr w:type="spellStart"/>
+      <w:proofErr w:type="gramStart"/>
+      <w:r>
+        <w:rPr>
+          <w:rFonts w:ascii="Montserrat" w:hAnsi="Montserrat"/>
+          <w:i w:val="0"/>
+          <w:iCs w:val="0"/>
+          <w:color w:val="CC1903"/>
+          <w:sz w:val="26"/>
+          <w:szCs w:val="26"/>
+        </w:rPr>
+        <w:t>inserisciServizioDettagli</w:t>
+      </w:r>
+      <w:proofErr w:type="spellEnd"/>
+      <w:r>
+        <w:rPr>
+          <w:rFonts w:ascii="Montserrat" w:hAnsi="Montserrat"/>
+          <w:i w:val="0"/>
+          <w:iCs w:val="0"/>
+          <w:color w:val="CC1903"/>
+          <w:sz w:val="26"/>
+          <w:szCs w:val="26"/>
+        </w:rPr>
+        <w:t>(</w:t>
+      </w:r>
+      <w:proofErr w:type="gramEnd"/>
+      <w:r>
+        <w:rPr>
+          <w:rFonts w:ascii="Montserrat" w:hAnsi="Montserrat"/>
+          <w:i w:val="0"/>
+          <w:iCs w:val="0"/>
+          <w:color w:val="CC1903"/>
+          <w:sz w:val="26"/>
+          <w:szCs w:val="26"/>
+        </w:rPr>
+        <w:t>)</w:t>
+      </w:r>
+      <w:bookmarkEnd w:id="21"/>
+    </w:p>
+    <w:p>
+      <w:pPr>
+        <w:jc w:val="center"/>
+        <w:rPr>
+          <w:rFonts w:ascii="Montserrat" w:hAnsi="Montserrat"/>
+          <w:color w:val="CC1903"/>
+          <w:sz w:val="26"/>
+          <w:szCs w:val="26"/>
+        </w:rPr>
+      </w:pPr>
+      <w:r>
+        <w:rPr>
+          <w:rFonts w:ascii="Montserrat" w:hAnsi="Montserrat"/>
+          <w:noProof/>
+          <w:color w:val="CC1903"/>
+          <w:sz w:val="26"/>
+          <w:szCs w:val="26"/>
+        </w:rPr>
+        <w:drawing>
+          <wp:inline distT="0" distB="0" distL="0" distR="0" wp14:anchorId="43CA53A1" wp14:editId="03C1689C">
+            <wp:extent cx="5916637" cy="2695575"/>
+            <wp:effectExtent l="0" t="0" r="8255" b="0"/>
+            <wp:docPr id="565710918" name="Immagine 9" descr="Immagine che contiene testo, schermata, diagramma, linea&#10;&#10;Il contenuto generato dall'IA potrebbe non essere corretto."/>
+            <wp:cNvGraphicFramePr>
+              <a:graphicFrameLocks xmlns:a="http://schemas.openxmlformats.org/drawingml/2006/main" noChangeAspect="1"/>
+            </wp:cNvGraphicFramePr>
+            <a:graphic xmlns:a="http://schemas.openxmlformats.org/drawingml/2006/main">
+              <a:graphicData uri="http://schemas.openxmlformats.org/drawingml/2006/picture">
+                <pic:pic xmlns:pic="http://schemas.openxmlformats.org/drawingml/2006/picture">
+                  <pic:nvPicPr>
+                    <pic:cNvPr id="565710918" name="Immagine 9" descr="Immagine che contiene testo, schermata, diagramma, linea&#10;&#10;Il contenuto generato dall'IA potrebbe non essere corretto."/>
+                    <pic:cNvPicPr/>
+                  </pic:nvPicPr>
+                  <pic:blipFill>
+                    <a:blip r:embed="rId15">
+                      <a:extLst>
+                        <a:ext uri="{28A0092B-C50C-407E-A947-70E740481C1C}">
+                          <a14:useLocalDpi xmlns:a14="http://schemas.microsoft.com/office/drawing/2010/main" val="0"/>
+                        </a:ext>
+                      </a:extLst>
+                    </a:blip>
+                    <a:stretch>
+                      <a:fillRect/>
+                    </a:stretch>
+                  </pic:blipFill>
+                  <pic:spPr>
+                    <a:xfrm>
+                      <a:off x="0" y="0"/>
+                      <a:ext cx="5916637" cy="2695575"/>
+                    </a:xfrm>
+                    <a:prstGeom prst="rect">
+                      <a:avLst/>
+                    </a:prstGeom>
+                  </pic:spPr>
+                </pic:pic>
+              </a:graphicData>
+            </a:graphic>
+          </wp:inline>
+        </w:drawing>
+      </w:r>
+    </w:p>
+    <w:p>
+      <w:pPr>
+        <w:pStyle w:val="Titolo4"/>
+        <w:rPr>
+          <w:rFonts w:ascii="Montserrat" w:hAnsi="Montserrat"/>
+          <w:i w:val="0"/>
+          <w:iCs w:val="0"/>
+          <w:color w:val="CC1903"/>
+          <w:sz w:val="26"/>
+          <w:szCs w:val="26"/>
+        </w:rPr>
+      </w:pPr>
+      <w:bookmarkStart w:id="22" w:name="_Toc222162214"/>
+      <w:r>
+        <w:rPr>
+          <w:rFonts w:ascii="Montserrat" w:hAnsi="Montserrat"/>
+          <w:i w:val="0"/>
+          <w:iCs w:val="0"/>
+          <w:color w:val="CC1903"/>
+          <w:sz w:val="26"/>
+          <w:szCs w:val="26"/>
+        </w:rPr>
+        <w:lastRenderedPageBreak/>
+        <w:t xml:space="preserve">3.3.4. </w:t>
+      </w:r>
+      <w:proofErr w:type="spellStart"/>
+      <w:proofErr w:type="gramStart"/>
+      <w:r>
+        <w:rPr>
+          <w:rFonts w:ascii="Montserrat" w:hAnsi="Montserrat"/>
+          <w:i w:val="0"/>
+          <w:iCs w:val="0"/>
+          <w:color w:val="CC1903"/>
+          <w:sz w:val="26"/>
+          <w:szCs w:val="26"/>
+        </w:rPr>
+        <w:t>confermaEvento</w:t>
+      </w:r>
+      <w:proofErr w:type="spellEnd"/>
+      <w:r>
+        <w:rPr>
+          <w:rFonts w:ascii="Montserrat" w:hAnsi="Montserrat"/>
+          <w:i w:val="0"/>
+          <w:iCs w:val="0"/>
+          <w:color w:val="CC1903"/>
+          <w:sz w:val="26"/>
+          <w:szCs w:val="26"/>
+        </w:rPr>
+        <w:t>(</w:t>
+      </w:r>
+      <w:proofErr w:type="gramEnd"/>
+      <w:r>
+        <w:rPr>
+          <w:rFonts w:ascii="Montserrat" w:hAnsi="Montserrat"/>
+          <w:i w:val="0"/>
+          <w:iCs w:val="0"/>
+          <w:color w:val="CC1903"/>
+          <w:sz w:val="26"/>
+          <w:szCs w:val="26"/>
+        </w:rPr>
+        <w:t>)</w:t>
+      </w:r>
+      <w:bookmarkEnd w:id="22"/>
+    </w:p>
+    <w:p>
+      <w:pPr>
+        <w:jc w:val="center"/>
+        <w:rPr>
+          <w:rFonts w:ascii="Montserrat" w:hAnsi="Montserrat"/>
+          <w:color w:val="CC1903"/>
+          <w:sz w:val="26"/>
+          <w:szCs w:val="26"/>
+        </w:rPr>
+      </w:pPr>
+      <w:r>
+        <w:rPr>
+          <w:rFonts w:ascii="Montserrat" w:hAnsi="Montserrat"/>
+          <w:noProof/>
+          <w:color w:val="CC1903"/>
+          <w:sz w:val="26"/>
+          <w:szCs w:val="26"/>
+        </w:rPr>
+        <w:drawing>
+          <wp:inline distT="0" distB="0" distL="0" distR="0" wp14:anchorId="1FA916AD" wp14:editId="39944A5F">
+            <wp:extent cx="6119968" cy="2959734"/>
+            <wp:effectExtent l="0" t="0" r="0" b="0"/>
+            <wp:docPr id="2058017605" name="Immagine 10"/>
+            <wp:cNvGraphicFramePr>
+              <a:graphicFrameLocks xmlns:a="http://schemas.openxmlformats.org/drawingml/2006/main" noChangeAspect="1"/>
+            </wp:cNvGraphicFramePr>
+            <a:graphic xmlns:a="http://schemas.openxmlformats.org/drawingml/2006/main">
+              <a:graphicData uri="http://schemas.openxmlformats.org/drawingml/2006/picture">
+                <pic:pic xmlns:pic="http://schemas.openxmlformats.org/drawingml/2006/picture">
+                  <pic:nvPicPr>
+                    <pic:cNvPr id="2058017605" name="Immagine 10"/>
+                    <pic:cNvPicPr/>
+                  </pic:nvPicPr>
+                  <pic:blipFill>
+                    <a:blip r:embed="rId16">
+                      <a:extLst>
+                        <a:ext uri="{28A0092B-C50C-407E-A947-70E740481C1C}">
+                          <a14:useLocalDpi xmlns:a14="http://schemas.microsoft.com/office/drawing/2010/main" val="0"/>
+                        </a:ext>
+                      </a:extLst>
+                    </a:blip>
+                    <a:stretch>
+                      <a:fillRect/>
+                    </a:stretch>
+                  </pic:blipFill>
+                  <pic:spPr>
+                    <a:xfrm>
+                      <a:off x="0" y="0"/>
+                      <a:ext cx="6119968" cy="2959734"/>
+                    </a:xfrm>
+                    <a:prstGeom prst="rect">
+                      <a:avLst/>
+                    </a:prstGeom>
+                  </pic:spPr>
+                </pic:pic>
+              </a:graphicData>
+            </a:graphic>
+          </wp:inline>
+        </w:drawing>
+      </w:r>
+    </w:p>
+    <w:p>
+      <w:pPr>
+        <w:pStyle w:val="Titolo3"/>
+        <w:rPr>
+          <w:rFonts w:ascii="Montserrat" w:hAnsi="Montserrat"/>
+          <w:color w:val="CC1903"/>
+        </w:rPr>
+      </w:pPr>
+      <w:bookmarkStart w:id="23" w:name="_Toc222162215"/>
+      <w:r>
+        <w:rPr>
+          <w:rFonts w:ascii="Montserrat" w:hAnsi="Montserrat"/>
+          <w:color w:val="CC1903"/>
+        </w:rPr>
+        <w:t>3.4. Diagrammi di Sequenza UC3</w:t>
+      </w:r>
+      <w:bookmarkEnd w:id="23"/>
+    </w:p>
+    <w:p>
+      <w:pPr>
+        <w:jc w:val="both"/>
+        <w:rPr>
+          <w:rFonts w:ascii="Montserrat" w:hAnsi="Montserrat"/>
+          <w:color w:val="272728"/>
+          <w:sz w:val="24"/>
+          <w:szCs w:val="24"/>
+        </w:rPr>
+      </w:pPr>
+      <w:r>
+        <w:rPr>
+          <w:rFonts w:ascii="Montserrat" w:hAnsi="Montserrat"/>
+          <w:color w:val="272728"/>
+          <w:sz w:val="24"/>
+          <w:szCs w:val="24"/>
+        </w:rPr>
+        <w:t xml:space="preserve">In questo terzo caso d’uso, il sistema </w:t>
+      </w:r>
+      <w:proofErr w:type="spellStart"/>
+      <w:r>
+        <w:rPr>
+          <w:rFonts w:ascii="Montserrat" w:hAnsi="Montserrat"/>
+          <w:color w:val="272728"/>
+          <w:sz w:val="24"/>
+          <w:szCs w:val="24"/>
+        </w:rPr>
+        <w:t>CulturalFlow</w:t>
+      </w:r>
+      <w:proofErr w:type="spellEnd"/>
+      <w:r>
+        <w:rPr>
+          <w:rFonts w:ascii="Montserrat" w:hAnsi="Montserrat"/>
+          <w:color w:val="272728"/>
+          <w:sz w:val="24"/>
+          <w:szCs w:val="24"/>
+        </w:rPr>
+        <w:t xml:space="preserve"> ha la responsabilità di creare l</w:t>
+      </w:r>
+      <w:r>
+        <w:rPr>
+          <w:rFonts w:ascii="Montserrat" w:hAnsi="Montserrat"/>
+          <w:color w:val="272728"/>
+          <w:sz w:val="24"/>
+          <w:szCs w:val="24"/>
+        </w:rPr>
+        <w:t>’</w:t>
+      </w:r>
+      <w:r>
+        <w:rPr>
+          <w:rFonts w:ascii="Montserrat" w:hAnsi="Montserrat"/>
+          <w:color w:val="272728"/>
+          <w:sz w:val="24"/>
+          <w:szCs w:val="24"/>
+        </w:rPr>
+        <w:t xml:space="preserve">istanza di </w:t>
+      </w:r>
+      <w:proofErr w:type="spellStart"/>
+      <w:r>
+        <w:rPr>
+          <w:rFonts w:ascii="Montserrat" w:hAnsi="Montserrat"/>
+          <w:color w:val="272728"/>
+          <w:sz w:val="24"/>
+          <w:szCs w:val="24"/>
+        </w:rPr>
+        <w:t>elencoEventiDisponibili</w:t>
+      </w:r>
+      <w:proofErr w:type="spellEnd"/>
+      <w:r>
+        <w:rPr>
+          <w:rFonts w:ascii="Montserrat" w:hAnsi="Montserrat"/>
+          <w:color w:val="272728"/>
+          <w:sz w:val="24"/>
+          <w:szCs w:val="24"/>
+        </w:rPr>
+        <w:t xml:space="preserve"> di tipo List&lt;Evento&gt;. Questo ci permette di avere una struttura dati temporanea per memorizzare e poi mostrare al Cliente i risultati filtrati durante l’esecuzione del metodo </w:t>
+      </w:r>
+      <w:proofErr w:type="spellStart"/>
+      <w:r>
+        <w:rPr>
+          <w:rFonts w:ascii="Montserrat" w:hAnsi="Montserrat"/>
+          <w:color w:val="272728"/>
+          <w:sz w:val="24"/>
+          <w:szCs w:val="24"/>
+        </w:rPr>
+        <w:t>cercaEvento</w:t>
+      </w:r>
+      <w:proofErr w:type="spellEnd"/>
+      <w:r>
+        <w:rPr>
+          <w:rFonts w:ascii="Montserrat" w:hAnsi="Montserrat"/>
+          <w:color w:val="272728"/>
+          <w:sz w:val="24"/>
+          <w:szCs w:val="24"/>
+        </w:rPr>
+        <w:t xml:space="preserve">. Inoltre, la classe Evento qui agisce come esperto delle informazioni per quanto riguardi i propri attributi, secondo il </w:t>
+      </w:r>
+      <w:r>
+        <w:rPr>
+          <w:rFonts w:ascii="Montserrat" w:hAnsi="Montserrat"/>
+          <w:i/>
+          <w:iCs/>
+          <w:color w:val="272728"/>
+          <w:sz w:val="24"/>
+          <w:szCs w:val="24"/>
+        </w:rPr>
+        <w:t>pattern Information Expert</w:t>
+      </w:r>
+      <w:r>
+        <w:rPr>
+          <w:rFonts w:ascii="Montserrat" w:hAnsi="Montserrat"/>
+          <w:color w:val="272728"/>
+          <w:sz w:val="24"/>
+          <w:szCs w:val="24"/>
+        </w:rPr>
+        <w:t>.</w:t>
+      </w:r>
+    </w:p>
+    <w:p>
+      <w:pPr>
+        <w:pStyle w:val="Titolo4"/>
+        <w:rPr>
+          <w:rFonts w:ascii="Montserrat" w:hAnsi="Montserrat"/>
+          <w:i w:val="0"/>
+          <w:iCs w:val="0"/>
+          <w:color w:val="CC1903"/>
+          <w:sz w:val="26"/>
+          <w:szCs w:val="26"/>
+        </w:rPr>
+      </w:pPr>
+      <w:bookmarkStart w:id="24" w:name="_Toc222162216"/>
+      <w:r>
+        <w:rPr>
+          <w:rFonts w:ascii="Montserrat" w:hAnsi="Montserrat"/>
+          <w:i w:val="0"/>
+          <w:iCs w:val="0"/>
+          <w:color w:val="CC1903"/>
+          <w:sz w:val="26"/>
+          <w:szCs w:val="26"/>
+        </w:rPr>
+        <w:t xml:space="preserve">3.4.1. </w:t>
+      </w:r>
+      <w:proofErr w:type="spellStart"/>
+      <w:proofErr w:type="gramStart"/>
+      <w:r>
+        <w:rPr>
+          <w:rFonts w:ascii="Montserrat" w:hAnsi="Montserrat"/>
+          <w:i w:val="0"/>
+          <w:iCs w:val="0"/>
+          <w:color w:val="CC1903"/>
+          <w:sz w:val="26"/>
+          <w:szCs w:val="26"/>
+        </w:rPr>
+        <w:t>cercaEvento</w:t>
+      </w:r>
+      <w:proofErr w:type="spellEnd"/>
+      <w:r>
+        <w:rPr>
+          <w:rFonts w:ascii="Montserrat" w:hAnsi="Montserrat"/>
+          <w:i w:val="0"/>
+          <w:iCs w:val="0"/>
+          <w:color w:val="CC1903"/>
+          <w:sz w:val="26"/>
+          <w:szCs w:val="26"/>
+        </w:rPr>
+        <w:t>(</w:t>
+      </w:r>
+      <w:proofErr w:type="gramEnd"/>
+      <w:r>
+        <w:rPr>
+          <w:rFonts w:ascii="Montserrat" w:hAnsi="Montserrat"/>
+          <w:i w:val="0"/>
+          <w:iCs w:val="0"/>
+          <w:color w:val="CC1903"/>
+          <w:sz w:val="26"/>
+          <w:szCs w:val="26"/>
+        </w:rPr>
+        <w:t>)</w:t>
+      </w:r>
+      <w:bookmarkEnd w:id="24"/>
+    </w:p>
+    <w:p>
+      <w:pPr>
+        <w:jc w:val="center"/>
+        <w:rPr>
+          <w:rFonts w:ascii="Montserrat" w:hAnsi="Montserrat"/>
+          <w:color w:val="CC1903"/>
+          <w:sz w:val="26"/>
+          <w:szCs w:val="26"/>
+        </w:rPr>
+      </w:pPr>
+      <w:r>
+        <w:rPr>
+          <w:rFonts w:ascii="Montserrat" w:hAnsi="Montserrat"/>
+          <w:noProof/>
+          <w:color w:val="CC1903"/>
+          <w:sz w:val="26"/>
+          <w:szCs w:val="26"/>
+        </w:rPr>
+        <w:drawing>
+          <wp:inline distT="0" distB="0" distL="0" distR="0" wp14:anchorId="48E2E1C6" wp14:editId="59865D33">
+            <wp:extent cx="6120128" cy="3480573"/>
+            <wp:effectExtent l="0" t="0" r="0" b="5715"/>
+            <wp:docPr id="1235319416" name="Immagine 17"/>
+            <wp:cNvGraphicFramePr>
+              <a:graphicFrameLocks xmlns:a="http://schemas.openxmlformats.org/drawingml/2006/main" noChangeAspect="1"/>
+            </wp:cNvGraphicFramePr>
+            <a:graphic xmlns:a="http://schemas.openxmlformats.org/drawingml/2006/main">
+              <a:graphicData uri="http://schemas.openxmlformats.org/drawingml/2006/picture">
+                <pic:pic xmlns:pic="http://schemas.openxmlformats.org/drawingml/2006/picture">
+                  <pic:nvPicPr>
+                    <pic:cNvPr id="1235319416" name="Immagine 17"/>
+                    <pic:cNvPicPr/>
+                  </pic:nvPicPr>
+                  <pic:blipFill>
+                    <a:blip r:embed="rId17" cstate="print">
+                      <a:extLst>
+                        <a:ext uri="{28A0092B-C50C-407E-A947-70E740481C1C}">
+                          <a14:useLocalDpi xmlns:a14="http://schemas.microsoft.com/office/drawing/2010/main" val="0"/>
+                        </a:ext>
+                      </a:extLst>
+                    </a:blip>
+                    <a:stretch>
+                      <a:fillRect/>
+                    </a:stretch>
+                  </pic:blipFill>
+                  <pic:spPr>
+                    <a:xfrm>
+                      <a:off x="0" y="0"/>
+                      <a:ext cx="6120128" cy="3480573"/>
+                    </a:xfrm>
+                    <a:prstGeom prst="rect">
+                      <a:avLst/>
+                    </a:prstGeom>
+                  </pic:spPr>
+                </pic:pic>
+              </a:graphicData>
+            </a:graphic>
+          </wp:inline>
+        </w:drawing>
+      </w:r>
+    </w:p>
+    <w:p>
+      <w:pPr>
+        <w:jc w:val="center"/>
+        <w:rPr>
+          <w:rFonts w:ascii="Montserrat" w:hAnsi="Montserrat"/>
+          <w:color w:val="CC1903"/>
+          <w:sz w:val="26"/>
+          <w:szCs w:val="26"/>
+        </w:rPr>
+      </w:pPr>
+    </w:p>
+    <w:p>
+      <w:pPr>
+        <w:pStyle w:val="Titolo3"/>
+        <w:rPr>
+          <w:rFonts w:ascii="Montserrat" w:hAnsi="Montserrat"/>
+          <w:color w:val="CC1903"/>
+        </w:rPr>
+      </w:pPr>
+      <w:bookmarkStart w:id="25" w:name="_Toc222162217"/>
+      <w:r>
+        <w:rPr>
+          <w:rFonts w:ascii="Montserrat" w:hAnsi="Montserrat"/>
+          <w:color w:val="CC1903"/>
+        </w:rPr>
+        <w:lastRenderedPageBreak/>
+        <w:t>3.4. Diagramma delle Classi (DCD)</w:t>
+      </w:r>
+      <w:bookmarkEnd w:id="25"/>
+    </w:p>
+    <w:p>
+      <w:pPr>
+        <w:jc w:val="both"/>
+        <w:rPr>
+          <w:rFonts w:ascii="Montserrat" w:hAnsi="Montserrat"/>
+          <w:color w:val="272728"/>
+          <w:sz w:val="24"/>
+          <w:szCs w:val="24"/>
+        </w:rPr>
+      </w:pPr>
+      <w:r>
+        <w:rPr>
+          <w:rFonts w:ascii="Montserrat" w:hAnsi="Montserrat"/>
+          <w:color w:val="272728"/>
+          <w:sz w:val="24"/>
+          <w:szCs w:val="24"/>
+        </w:rPr>
+        <w:t xml:space="preserve">Il diagramma delle classi mostra la struttura statica del sistema. Le classi sono state arricchite con i metodi derivati dai contratti delle operazioni e dai diagrammi di sequenza. È possibile individuare i </w:t>
+      </w:r>
+      <w:r>
+        <w:rPr>
+          <w:rFonts w:ascii="Montserrat" w:hAnsi="Montserrat"/>
+          <w:i/>
+          <w:iCs/>
+          <w:color w:val="272728"/>
+          <w:sz w:val="24"/>
+          <w:szCs w:val="24"/>
+        </w:rPr>
+        <w:t>pattern Singleton</w:t>
+      </w:r>
+      <w:r>
+        <w:rPr>
+          <w:rFonts w:ascii="Montserrat" w:hAnsi="Montserrat"/>
+          <w:color w:val="272728"/>
+          <w:sz w:val="24"/>
+          <w:szCs w:val="24"/>
+        </w:rPr>
+        <w:t xml:space="preserve"> e </w:t>
+      </w:r>
+      <w:r>
+        <w:rPr>
+          <w:rFonts w:ascii="Montserrat" w:hAnsi="Montserrat"/>
+          <w:i/>
+          <w:iCs/>
+          <w:color w:val="272728"/>
+          <w:sz w:val="24"/>
+          <w:szCs w:val="24"/>
+        </w:rPr>
+        <w:t>Controller</w:t>
+      </w:r>
+      <w:r>
+        <w:rPr>
+          <w:rFonts w:ascii="Montserrat" w:hAnsi="Montserrat"/>
+          <w:color w:val="272728"/>
+          <w:sz w:val="24"/>
+          <w:szCs w:val="24"/>
+        </w:rPr>
+        <w:t xml:space="preserve">, applicati alla classe </w:t>
+      </w:r>
+      <w:proofErr w:type="spellStart"/>
+      <w:r>
+        <w:rPr>
+          <w:rFonts w:ascii="Montserrat" w:hAnsi="Montserrat"/>
+          <w:color w:val="272728"/>
+          <w:sz w:val="24"/>
+          <w:szCs w:val="24"/>
+        </w:rPr>
+        <w:t>CulturalFlow</w:t>
+      </w:r>
+      <w:proofErr w:type="spellEnd"/>
+      <w:r>
+        <w:rPr>
+          <w:rFonts w:ascii="Montserrat" w:hAnsi="Montserrat"/>
+          <w:color w:val="272728"/>
+          <w:sz w:val="24"/>
+          <w:szCs w:val="24"/>
+        </w:rPr>
+        <w:t xml:space="preserve">, e il </w:t>
+      </w:r>
+      <w:r>
+        <w:rPr>
+          <w:rFonts w:ascii="Montserrat" w:hAnsi="Montserrat"/>
+          <w:i/>
+          <w:iCs/>
+          <w:color w:val="272728"/>
+          <w:sz w:val="24"/>
+          <w:szCs w:val="24"/>
+        </w:rPr>
+        <w:t>pattern Builder</w:t>
+      </w:r>
+      <w:r>
+        <w:rPr>
+          <w:rFonts w:ascii="Montserrat" w:hAnsi="Montserrat"/>
+          <w:color w:val="272728"/>
+          <w:sz w:val="24"/>
+          <w:szCs w:val="24"/>
+        </w:rPr>
+        <w:t xml:space="preserve"> usato per la gestione della creazione complessa dell’oggetto Evento.</w:t>
+      </w:r>
+    </w:p>
+    <w:p>
+      <w:pPr>
+        <w:jc w:val="center"/>
+        <w:rPr>
+          <w:rFonts w:ascii="Montserrat" w:hAnsi="Montserrat"/>
+          <w:color w:val="272728"/>
+          <w:sz w:val="24"/>
+          <w:szCs w:val="24"/>
+        </w:rPr>
+      </w:pPr>
+      <w:r>
+        <w:rPr>
+          <w:rFonts w:ascii="Montserrat" w:hAnsi="Montserrat"/>
+          <w:noProof/>
+          <w:color w:val="272728"/>
+          <w:sz w:val="24"/>
+          <w:szCs w:val="24"/>
+        </w:rPr>
+        <w:drawing>
+          <wp:inline distT="0" distB="0" distL="0" distR="0" wp14:anchorId="1372C6E7" wp14:editId="1308F407">
+            <wp:extent cx="5900982" cy="3093718"/>
+            <wp:effectExtent l="0" t="0" r="5080" b="0"/>
+            <wp:docPr id="1007429099" name="Immagine 19"/>
+            <wp:cNvGraphicFramePr>
+              <a:graphicFrameLocks xmlns:a="http://schemas.openxmlformats.org/drawingml/2006/main" noChangeAspect="1"/>
+            </wp:cNvGraphicFramePr>
+            <a:graphic xmlns:a="http://schemas.openxmlformats.org/drawingml/2006/main">
+              <a:graphicData uri="http://schemas.openxmlformats.org/drawingml/2006/picture">
+                <pic:pic xmlns:pic="http://schemas.openxmlformats.org/drawingml/2006/picture">
+                  <pic:nvPicPr>
+                    <pic:cNvPr id="1007429099" name="Immagine 19"/>
+                    <pic:cNvPicPr/>
+                  </pic:nvPicPr>
+                  <pic:blipFill>
+                    <a:blip r:embed="rId18" cstate="print">
+                      <a:extLst>
+                        <a:ext uri="{28A0092B-C50C-407E-A947-70E740481C1C}">
+                          <a14:useLocalDpi xmlns:a14="http://schemas.microsoft.com/office/drawing/2010/main" val="0"/>
+                        </a:ext>
+                      </a:extLst>
+                    </a:blip>
+                    <a:stretch>
+                      <a:fillRect/>
+                    </a:stretch>
+                  </pic:blipFill>
+                  <pic:spPr>
+                    <a:xfrm>
+                      <a:off x="0" y="0"/>
+                      <a:ext cx="5900982" cy="3093718"/>
+                    </a:xfrm>
+                    <a:prstGeom prst="rect">
+                      <a:avLst/>
+                    </a:prstGeom>
+                  </pic:spPr>
+                </pic:pic>
+              </a:graphicData>
+            </a:graphic>
+          </wp:inline>
+        </w:drawing>
+      </w:r>
     </w:p>
     <w:p>
       <w:pPr>

</xml_diff>